<commit_message>
customizing login page, creating main project screens
</commit_message>
<xml_diff>
--- a/docs/1.  Project Plan.docx
+++ b/docs/1.  Project Plan.docx
@@ -2462,6 +2462,7 @@
       </w:pPr>
       <w:bookmarkStart w:id="6" w:name="_Toc168306349"/>
       <w:r>
+        <w:lastRenderedPageBreak/>
         <w:t>Objectives</w:t>
       </w:r>
       <w:bookmarkEnd w:id="6"/>
@@ -2850,6 +2851,7 @@
       </w:pPr>
       <w:bookmarkStart w:id="11" w:name="_Toc168306354"/>
       <w:r>
+        <w:lastRenderedPageBreak/>
         <w:t>Out-of-Scope Features</w:t>
       </w:r>
       <w:bookmarkEnd w:id="11"/>
@@ -3199,6 +3201,7 @@
         <w:rPr>
           <w:rStyle w:val="Strong"/>
         </w:rPr>
+        <w:lastRenderedPageBreak/>
         <w:t>Tasks:</w:t>
       </w:r>
     </w:p>
@@ -3563,6 +3566,7 @@
           <w:rStyle w:val="Strong"/>
           <w:rFonts w:eastAsiaTheme="majorEastAsia"/>
         </w:rPr>
+        <w:lastRenderedPageBreak/>
         <w:t>Milestones:</w:t>
       </w:r>
     </w:p>
@@ -3632,15 +3636,7 @@
       </w:r>
       <w:proofErr w:type="spellEnd"/>
       <w:r>
-        <w:t xml:space="preserve">, </w:t>
-      </w:r>
-      <w:proofErr w:type="spellStart"/>
-      <w:r>
-        <w:t>CodeBuild</w:t>
-      </w:r>
-      <w:proofErr w:type="spellEnd"/>
-      <w:r>
-        <w:t>).</w:t>
+        <w:t>, CodeBuild).</w:t>
       </w:r>
     </w:p>
     <w:p>
@@ -3840,11 +3836,17 @@
       </w:r>
     </w:p>
     <w:p>
+      <w:r>
+        <w:br w:type="page"/>
+      </w:r>
+    </w:p>
+    <w:p>
       <w:pPr>
         <w:pStyle w:val="Heading2"/>
       </w:pPr>
       <w:bookmarkStart w:id="18" w:name="_Toc168306361"/>
       <w:r>
+        <w:lastRenderedPageBreak/>
         <w:t>Timeline</w:t>
       </w:r>
       <w:bookmarkEnd w:id="18"/>
@@ -3856,14 +3858,11 @@
     </w:p>
     <w:p>
       <w:r>
-        <w:rPr>
-          <w:noProof/>
-        </w:rPr>
         <w:drawing>
-          <wp:inline distT="0" distB="0" distL="0" distR="0" wp14:anchorId="370B954E" wp14:editId="21B930BE">
-            <wp:extent cx="5943600" cy="2917825"/>
-            <wp:effectExtent l="0" t="0" r="0" b="0"/>
-            <wp:docPr id="555081079" name="Picture 1" descr="A graph with different colored squares&#10;&#10;Description automatically generated"/>
+          <wp:inline distT="0" distB="0" distL="0" distR="0" wp14:anchorId="5341D904" wp14:editId="42A62467">
+            <wp:extent cx="5943600" cy="2882900"/>
+            <wp:effectExtent l="190500" t="190500" r="190500" b="184150"/>
+            <wp:docPr id="1920437853" name="Picture 1" descr="A graph of a graph&#10;&#10;Description automatically generated with medium confidence"/>
             <wp:cNvGraphicFramePr>
               <a:graphicFrameLocks xmlns:a="http://schemas.openxmlformats.org/drawingml/2006/main" noChangeAspect="1"/>
             </wp:cNvGraphicFramePr>
@@ -3871,17 +3870,11 @@
               <a:graphicData uri="http://schemas.openxmlformats.org/drawingml/2006/picture">
                 <pic:pic xmlns:pic="http://schemas.openxmlformats.org/drawingml/2006/picture">
                   <pic:nvPicPr>
-                    <pic:cNvPr id="1462988509" name="Picture 1" descr="A graph with different colored squares&#10;&#10;Description automatically generated"/>
+                    <pic:cNvPr id="1920437853" name="Picture 1" descr="A graph of a graph&#10;&#10;Description automatically generated with medium confidence"/>
                     <pic:cNvPicPr/>
                   </pic:nvPicPr>
                   <pic:blipFill>
-                    <a:blip r:embed="rId9" cstate="print">
-                      <a:extLst>
-                        <a:ext uri="{28A0092B-C50C-407E-A947-70E740481C1C}">
-                          <a14:useLocalDpi xmlns:a14="http://schemas.microsoft.com/office/drawing/2010/main" val="0"/>
-                        </a:ext>
-                      </a:extLst>
-                    </a:blip>
+                    <a:blip r:embed="rId9"/>
                     <a:stretch>
                       <a:fillRect/>
                     </a:stretch>
@@ -3889,11 +3882,21 @@
                   <pic:spPr>
                     <a:xfrm>
                       <a:off x="0" y="0"/>
-                      <a:ext cx="5943600" cy="2917825"/>
+                      <a:ext cx="5943600" cy="2882900"/>
                     </a:xfrm>
                     <a:prstGeom prst="rect">
                       <a:avLst/>
                     </a:prstGeom>
+                    <a:ln>
+                      <a:noFill/>
+                    </a:ln>
+                    <a:effectLst>
+                      <a:outerShdw blurRad="190500" algn="tl" rotWithShape="0">
+                        <a:srgbClr val="000000">
+                          <a:alpha val="70000"/>
+                        </a:srgbClr>
+                      </a:outerShdw>
+                    </a:effectLst>
                   </pic:spPr>
                 </pic:pic>
               </a:graphicData>
@@ -3908,7 +3911,6 @@
       </w:pPr>
       <w:bookmarkStart w:id="19" w:name="_Toc168306362"/>
       <w:r>
-        <w:lastRenderedPageBreak/>
         <w:t>Resources</w:t>
       </w:r>
       <w:bookmarkEnd w:id="19"/>
@@ -4173,6 +4175,7 @@
           <w:szCs w:val="24"/>
           <w14:ligatures w14:val="none"/>
         </w:rPr>
+        <w:lastRenderedPageBreak/>
         <w:t>A framework for building native apps using React, ensuring a single codebase for multiple platforms (iOS, Android, Web).</w:t>
       </w:r>
     </w:p>
@@ -4488,17 +4491,8 @@
           <w:rStyle w:val="Strong"/>
           <w:rFonts w:eastAsiaTheme="majorEastAsia"/>
         </w:rPr>
-        <w:t xml:space="preserve">AWS </w:t>
-      </w:r>
-      <w:proofErr w:type="spellStart"/>
-      <w:r>
-        <w:rPr>
-          <w:rStyle w:val="Strong"/>
-          <w:rFonts w:eastAsiaTheme="majorEastAsia"/>
-        </w:rPr>
-        <w:t>CodeBuild</w:t>
-      </w:r>
-      <w:proofErr w:type="spellEnd"/>
+        <w:t>AWS CodeBuild</w:t>
+      </w:r>
     </w:p>
     <w:p>
       <w:pPr>
@@ -4647,6 +4641,7 @@
         <w:spacing w:before="100" w:beforeAutospacing="1" w:after="100" w:afterAutospacing="1" w:line="240" w:lineRule="auto"/>
       </w:pPr>
       <w:r>
+        <w:lastRenderedPageBreak/>
         <w:t>Enables governance, compliance, and operational and risk auditing of your AWS account. With CloudTrail, you can log, continuously monitor, and retain account activity related to actions across your AWS infrastructure.</w:t>
       </w:r>
     </w:p>
@@ -5188,6 +5183,7 @@
       </w:pPr>
       <w:bookmarkStart w:id="24" w:name="_Toc168306367"/>
       <w:r>
+        <w:lastRenderedPageBreak/>
         <w:t>Risk Identification</w:t>
       </w:r>
       <w:bookmarkEnd w:id="24"/>
@@ -5674,6 +5670,7 @@
         <w:spacing w:before="100" w:beforeAutospacing="1" w:after="100" w:afterAutospacing="1" w:line="240" w:lineRule="auto"/>
       </w:pPr>
       <w:r>
+        <w:lastRenderedPageBreak/>
         <w:t>Regularly review project progress and adjust timelines as needed.</w:t>
       </w:r>
     </w:p>
@@ -19158,6 +19155,8 @@
     <w:rsid w:val="002A621A"/>
     <w:rsid w:val="00527971"/>
     <w:rsid w:val="006E767F"/>
+    <w:rsid w:val="006F48BB"/>
+    <w:rsid w:val="00A029A6"/>
     <w:rsid w:val="00C1517E"/>
     <w:rsid w:val="00E84473"/>
     <w:rsid w:val="00F84FA6"/>

</xml_diff>